<commit_message>
Szakdolgozat: az M2 fejezeteinek tervezete, ábrák, sablon, generálás
</commit_message>
<xml_diff>
--- a/docs/dolgozat/sablon/reference.docx
+++ b/docs/dolgozat/sablon/reference.docx
@@ -737,10 +737,14 @@
     <w:basedOn w:val="Szvegtrzs"/>
     <w:qFormat/>
     <w:pPr>
-      <w:spacing w:before="36" w:after="36"/>
+      <w:spacing w:before="40" w:after="40" w:line="240" w:lineRule="auto"/>
       <w:ind w:firstLine="0"/>
       <w:jc w:val="left"/>
     </w:pPr>
+    <w:rPr>
+      <w:sz w:val="22"/>
+      <w:szCs w:val="22"/>
+    </w:rPr>
   </w:style>
   <w:style w:type="paragraph" w:styleId="Cm">
     <w:name w:val="Title"/>
@@ -1030,19 +1034,28 @@
     <w:qFormat/>
     <w:tblPr>
       <w:tblInd w:w="0" w:type="dxa"/>
+      <w:tblBorders>
+        <w:top w:val="single" w:sz="8" w:space="0" w:color="2C4A6E"/>
+        <w:bottom w:val="single" w:sz="8" w:space="0" w:color="2C4A6E"/>
+        <w:insideH w:val="single" w:sz="4" w:space="0" w:color="C9D1DC"/>
+      </w:tblBorders>
       <w:tblCellMar>
-        <w:top w:w="0" w:type="dxa"/>
-        <w:left w:w="108" w:type="dxa"/>
-        <w:bottom w:w="0" w:type="dxa"/>
-        <w:right w:w="108" w:type="dxa"/>
+        <w:top w:w="40" w:type="dxa"/>
+        <w:left w:w="100" w:type="dxa"/>
+        <w:bottom w:w="40" w:type="dxa"/>
+        <w:right w:w="100" w:type="dxa"/>
       </w:tblCellMar>
     </w:tblPr>
     <w:tblStylePr w:type="firstRow">
+      <w:rPr>
+        <w:b/>
+      </w:rPr>
       <w:tblPr/>
       <w:tcPr>
         <w:tcBorders>
-          <w:bottom w:val="single" w:sz="0" w:space="0" w:color="auto"/>
+          <w:bottom w:val="single" w:sz="8" w:space="0" w:color="2C4A6E"/>
         </w:tcBorders>
+        <w:shd w:val="clear" w:color="auto" w:fill="E8EDF3"/>
         <w:vAlign w:val="bottom"/>
       </w:tcPr>
     </w:tblStylePr>

</xml_diff>